<commit_message>
Refactor time leave handling and update related templates
- Updated TimeLeave model to allow nullable end_at field.
- Modified time leave creation and update logic to handle vacation, holiday, and sick leave types appropriately.
- Adjusted frontend JavaScript to reflect changes in leave calculations and display.
- Enhanced HTML templates for employee reports and QR code generation.
- Added new migration script to alter end_at column in time_leaves table to be nullable.
</commit_message>
<xml_diff>
--- a/templates/qr_template_bat_80.docx
+++ b/templates/qr_template_bat_80.docx
@@ -30,7 +30,7 @@
           </w:tcPr>
           <w:p>
             <w:pPr>
-              <w:jc w:val="center"/>
+              <w:jc w:val="right"/>
               <w:rPr>
                 <w:sz w:val="28"/>
                 <w:szCs w:val="32"/>
@@ -63,7 +63,7 @@
           </w:tcPr>
           <w:p>
             <w:pPr>
-              <w:jc w:val="center"/>
+              <w:jc w:val="right"/>
             </w:pPr>
             <w:r>
               <w:rPr>
@@ -92,7 +92,7 @@
           </w:tcPr>
           <w:p>
             <w:pPr>
-              <w:jc w:val="center"/>
+              <w:jc w:val="right"/>
             </w:pPr>
             <w:r>
               <w:rPr>
@@ -121,7 +121,7 @@
           </w:tcPr>
           <w:p>
             <w:pPr>
-              <w:jc w:val="center"/>
+              <w:jc w:val="right"/>
             </w:pPr>
             <w:r>
               <w:rPr>
@@ -155,40 +155,40 @@
           </w:tcPr>
           <w:p>
             <w:pPr>
+              <w:jc w:val="right"/>
+              <w:rPr>
+                <w:sz w:val="28"/>
+                <w:szCs w:val="32"/>
+              </w:rPr>
+            </w:pPr>
+            <w:r>
+              <w:rPr>
+                <w:sz w:val="28"/>
+                <w:szCs w:val="32"/>
+              </w:rPr>
+              <w:t>{{QR}}</w:t>
+            </w:r>
+          </w:p>
+        </w:tc>
+        <w:tc>
+          <w:tcPr>
+            <w:tcW w:w="2075" w:type="dxa"/>
+            <w:vAlign w:val="center"/>
+          </w:tcPr>
+          <w:p>
+            <w:r>
+              <w:t>{{mat_po}}</w:t>
+            </w:r>
+          </w:p>
+        </w:tc>
+        <w:tc>
+          <w:tcPr>
+            <w:tcW w:w="921" w:type="dxa"/>
+            <w:vAlign w:val="center"/>
+          </w:tcPr>
+          <w:p>
+            <w:pPr>
               <w:jc w:val="center"/>
-              <w:rPr>
-                <w:sz w:val="28"/>
-                <w:szCs w:val="32"/>
-              </w:rPr>
-            </w:pPr>
-            <w:r>
-              <w:rPr>
-                <w:sz w:val="28"/>
-                <w:szCs w:val="32"/>
-              </w:rPr>
-              <w:t>{{QR}}</w:t>
-            </w:r>
-          </w:p>
-        </w:tc>
-        <w:tc>
-          <w:tcPr>
-            <w:tcW w:w="2075" w:type="dxa"/>
-            <w:vAlign w:val="center"/>
-          </w:tcPr>
-          <w:p>
-            <w:r>
-              <w:t>{{mat_po}}</w:t>
-            </w:r>
-          </w:p>
-        </w:tc>
-        <w:tc>
-          <w:tcPr>
-            <w:tcW w:w="921" w:type="dxa"/>
-            <w:vAlign w:val="center"/>
-          </w:tcPr>
-          <w:p>
-            <w:pPr>
-              <w:jc w:val="center"/>
             </w:pPr>
             <w:r>
               <w:rPr>
@@ -217,7 +217,7 @@
           </w:tcPr>
           <w:p>
             <w:pPr>
-              <w:jc w:val="center"/>
+              <w:jc w:val="right"/>
             </w:pPr>
             <w:r>
               <w:rPr>
@@ -246,7 +246,7 @@
           </w:tcPr>
           <w:p>
             <w:pPr>
-              <w:jc w:val="center"/>
+              <w:jc w:val="right"/>
             </w:pPr>
             <w:r>
               <w:rPr>
@@ -280,7 +280,7 @@
           </w:tcPr>
           <w:p>
             <w:pPr>
-              <w:jc w:val="center"/>
+              <w:jc w:val="right"/>
               <w:rPr>
                 <w:sz w:val="28"/>
                 <w:szCs w:val="32"/>
@@ -313,7 +313,7 @@
           </w:tcPr>
           <w:p>
             <w:pPr>
-              <w:jc w:val="center"/>
+              <w:jc w:val="right"/>
             </w:pPr>
             <w:r>
               <w:rPr>
@@ -342,7 +342,7 @@
           </w:tcPr>
           <w:p>
             <w:pPr>
-              <w:jc w:val="center"/>
+              <w:jc w:val="right"/>
             </w:pPr>
             <w:r>
               <w:rPr>
@@ -371,7 +371,7 @@
           </w:tcPr>
           <w:p>
             <w:pPr>
-              <w:jc w:val="center"/>
+              <w:jc w:val="right"/>
             </w:pPr>
             <w:r>
               <w:rPr>
@@ -405,7 +405,7 @@
           </w:tcPr>
           <w:p>
             <w:pPr>
-              <w:jc w:val="center"/>
+              <w:jc w:val="right"/>
               <w:rPr>
                 <w:sz w:val="28"/>
                 <w:szCs w:val="32"/>
@@ -438,7 +438,7 @@
           </w:tcPr>
           <w:p>
             <w:pPr>
-              <w:jc w:val="center"/>
+              <w:jc w:val="right"/>
             </w:pPr>
             <w:r>
               <w:rPr>
@@ -467,7 +467,7 @@
           </w:tcPr>
           <w:p>
             <w:pPr>
-              <w:jc w:val="center"/>
+              <w:jc w:val="right"/>
             </w:pPr>
             <w:r>
               <w:rPr>
@@ -496,7 +496,7 @@
           </w:tcPr>
           <w:p>
             <w:pPr>
-              <w:jc w:val="center"/>
+              <w:jc w:val="right"/>
             </w:pPr>
             <w:r>
               <w:rPr>
@@ -530,7 +530,7 @@
           </w:tcPr>
           <w:p>
             <w:pPr>
-              <w:jc w:val="center"/>
+              <w:jc w:val="right"/>
               <w:rPr>
                 <w:sz w:val="28"/>
                 <w:szCs w:val="32"/>
@@ -563,7 +563,7 @@
           </w:tcPr>
           <w:p>
             <w:pPr>
-              <w:jc w:val="center"/>
+              <w:jc w:val="right"/>
             </w:pPr>
             <w:r>
               <w:rPr>
@@ -592,7 +592,7 @@
           </w:tcPr>
           <w:p>
             <w:pPr>
-              <w:jc w:val="center"/>
+              <w:jc w:val="right"/>
             </w:pPr>
             <w:r>
               <w:rPr>
@@ -621,7 +621,7 @@
           </w:tcPr>
           <w:p>
             <w:pPr>
-              <w:jc w:val="center"/>
+              <w:jc w:val="right"/>
             </w:pPr>
             <w:r>
               <w:rPr>
@@ -655,7 +655,7 @@
           </w:tcPr>
           <w:p>
             <w:pPr>
-              <w:jc w:val="center"/>
+              <w:jc w:val="right"/>
               <w:rPr>
                 <w:sz w:val="28"/>
                 <w:szCs w:val="32"/>
@@ -688,7 +688,7 @@
           </w:tcPr>
           <w:p>
             <w:pPr>
-              <w:jc w:val="center"/>
+              <w:jc w:val="right"/>
             </w:pPr>
             <w:r>
               <w:rPr>
@@ -717,7 +717,7 @@
           </w:tcPr>
           <w:p>
             <w:pPr>
-              <w:jc w:val="center"/>
+              <w:jc w:val="right"/>
             </w:pPr>
             <w:r>
               <w:rPr>
@@ -746,7 +746,7 @@
           </w:tcPr>
           <w:p>
             <w:pPr>
-              <w:jc w:val="center"/>
+              <w:jc w:val="right"/>
             </w:pPr>
             <w:r>
               <w:rPr>
@@ -780,7 +780,7 @@
           </w:tcPr>
           <w:p>
             <w:pPr>
-              <w:jc w:val="center"/>
+              <w:jc w:val="right"/>
               <w:rPr>
                 <w:sz w:val="28"/>
                 <w:szCs w:val="32"/>
@@ -813,7 +813,7 @@
           </w:tcPr>
           <w:p>
             <w:pPr>
-              <w:jc w:val="center"/>
+              <w:jc w:val="right"/>
             </w:pPr>
             <w:r>
               <w:rPr>
@@ -842,7 +842,7 @@
           </w:tcPr>
           <w:p>
             <w:pPr>
-              <w:jc w:val="center"/>
+              <w:jc w:val="right"/>
             </w:pPr>
             <w:r>
               <w:rPr>
@@ -871,7 +871,7 @@
           </w:tcPr>
           <w:p>
             <w:pPr>
-              <w:jc w:val="center"/>
+              <w:jc w:val="right"/>
             </w:pPr>
             <w:r>
               <w:rPr>
@@ -905,7 +905,7 @@
           </w:tcPr>
           <w:p>
             <w:pPr>
-              <w:jc w:val="center"/>
+              <w:jc w:val="right"/>
               <w:rPr>
                 <w:sz w:val="28"/>
                 <w:szCs w:val="32"/>
@@ -938,7 +938,7 @@
           </w:tcPr>
           <w:p>
             <w:pPr>
-              <w:jc w:val="center"/>
+              <w:jc w:val="right"/>
             </w:pPr>
             <w:r>
               <w:rPr>
@@ -967,7 +967,7 @@
           </w:tcPr>
           <w:p>
             <w:pPr>
-              <w:jc w:val="center"/>
+              <w:jc w:val="right"/>
             </w:pPr>
             <w:r>
               <w:rPr>
@@ -996,7 +996,7 @@
           </w:tcPr>
           <w:p>
             <w:pPr>
-              <w:jc w:val="center"/>
+              <w:jc w:val="right"/>
             </w:pPr>
             <w:r>
               <w:rPr>
@@ -1030,7 +1030,7 @@
           </w:tcPr>
           <w:p>
             <w:pPr>
-              <w:jc w:val="center"/>
+              <w:jc w:val="right"/>
               <w:rPr>
                 <w:sz w:val="28"/>
                 <w:szCs w:val="32"/>
@@ -1063,7 +1063,7 @@
           </w:tcPr>
           <w:p>
             <w:pPr>
-              <w:jc w:val="center"/>
+              <w:jc w:val="right"/>
             </w:pPr>
             <w:r>
               <w:rPr>
@@ -1092,7 +1092,7 @@
           </w:tcPr>
           <w:p>
             <w:pPr>
-              <w:jc w:val="center"/>
+              <w:jc w:val="right"/>
             </w:pPr>
             <w:r>
               <w:rPr>
@@ -1121,7 +1121,7 @@
           </w:tcPr>
           <w:p>
             <w:pPr>
-              <w:jc w:val="center"/>
+              <w:jc w:val="right"/>
             </w:pPr>
             <w:r>
               <w:rPr>
@@ -1155,7 +1155,7 @@
           </w:tcPr>
           <w:p>
             <w:pPr>
-              <w:jc w:val="center"/>
+              <w:jc w:val="right"/>
               <w:rPr>
                 <w:sz w:val="28"/>
                 <w:szCs w:val="32"/>
@@ -1188,7 +1188,7 @@
           </w:tcPr>
           <w:p>
             <w:pPr>
-              <w:jc w:val="center"/>
+              <w:jc w:val="right"/>
             </w:pPr>
             <w:r>
               <w:rPr>
@@ -1217,7 +1217,7 @@
           </w:tcPr>
           <w:p>
             <w:pPr>
-              <w:jc w:val="center"/>
+              <w:jc w:val="right"/>
             </w:pPr>
             <w:r>
               <w:rPr>
@@ -1246,7 +1246,7 @@
           </w:tcPr>
           <w:p>
             <w:pPr>
-              <w:jc w:val="center"/>
+              <w:jc w:val="right"/>
             </w:pPr>
             <w:r>
               <w:rPr>
@@ -1280,7 +1280,7 @@
           </w:tcPr>
           <w:p>
             <w:pPr>
-              <w:jc w:val="center"/>
+              <w:jc w:val="right"/>
               <w:rPr>
                 <w:sz w:val="28"/>
                 <w:szCs w:val="32"/>
@@ -1313,7 +1313,7 @@
           </w:tcPr>
           <w:p>
             <w:pPr>
-              <w:jc w:val="center"/>
+              <w:jc w:val="right"/>
             </w:pPr>
             <w:r>
               <w:rPr>
@@ -1342,7 +1342,7 @@
           </w:tcPr>
           <w:p>
             <w:pPr>
-              <w:jc w:val="center"/>
+              <w:jc w:val="right"/>
             </w:pPr>
             <w:r>
               <w:rPr>
@@ -1371,7 +1371,7 @@
           </w:tcPr>
           <w:p>
             <w:pPr>
-              <w:jc w:val="center"/>
+              <w:jc w:val="right"/>
             </w:pPr>
             <w:r>
               <w:rPr>
@@ -1405,7 +1405,7 @@
           </w:tcPr>
           <w:p>
             <w:pPr>
-              <w:jc w:val="center"/>
+              <w:jc w:val="right"/>
               <w:rPr>
                 <w:sz w:val="28"/>
                 <w:szCs w:val="32"/>
@@ -1438,7 +1438,7 @@
           </w:tcPr>
           <w:p>
             <w:pPr>
-              <w:jc w:val="center"/>
+              <w:jc w:val="right"/>
             </w:pPr>
             <w:r>
               <w:rPr>
@@ -1467,7 +1467,7 @@
           </w:tcPr>
           <w:p>
             <w:pPr>
-              <w:jc w:val="center"/>
+              <w:jc w:val="right"/>
             </w:pPr>
             <w:r>
               <w:rPr>
@@ -1496,7 +1496,7 @@
           </w:tcPr>
           <w:p>
             <w:pPr>
-              <w:jc w:val="center"/>
+              <w:jc w:val="right"/>
             </w:pPr>
             <w:r>
               <w:rPr>
@@ -1530,7 +1530,7 @@
           </w:tcPr>
           <w:p>
             <w:pPr>
-              <w:jc w:val="center"/>
+              <w:jc w:val="right"/>
               <w:rPr>
                 <w:sz w:val="28"/>
                 <w:szCs w:val="32"/>
@@ -1563,7 +1563,7 @@
           </w:tcPr>
           <w:p>
             <w:pPr>
-              <w:jc w:val="center"/>
+              <w:jc w:val="right"/>
             </w:pPr>
             <w:r>
               <w:rPr>
@@ -1592,7 +1592,7 @@
           </w:tcPr>
           <w:p>
             <w:pPr>
-              <w:jc w:val="center"/>
+              <w:jc w:val="right"/>
             </w:pPr>
             <w:r>
               <w:rPr>
@@ -1621,7 +1621,7 @@
           </w:tcPr>
           <w:p>
             <w:pPr>
-              <w:jc w:val="center"/>
+              <w:jc w:val="right"/>
             </w:pPr>
             <w:r>
               <w:rPr>
@@ -1655,7 +1655,7 @@
           </w:tcPr>
           <w:p>
             <w:pPr>
-              <w:jc w:val="center"/>
+              <w:jc w:val="right"/>
               <w:rPr>
                 <w:sz w:val="28"/>
                 <w:szCs w:val="32"/>
@@ -1688,7 +1688,7 @@
           </w:tcPr>
           <w:p>
             <w:pPr>
-              <w:jc w:val="center"/>
+              <w:jc w:val="right"/>
             </w:pPr>
             <w:r>
               <w:rPr>
@@ -1717,7 +1717,7 @@
           </w:tcPr>
           <w:p>
             <w:pPr>
-              <w:jc w:val="center"/>
+              <w:jc w:val="right"/>
             </w:pPr>
             <w:r>
               <w:rPr>
@@ -1746,7 +1746,7 @@
           </w:tcPr>
           <w:p>
             <w:pPr>
-              <w:jc w:val="center"/>
+              <w:jc w:val="right"/>
             </w:pPr>
             <w:r>
               <w:rPr>
@@ -1780,7 +1780,7 @@
           </w:tcPr>
           <w:p>
             <w:pPr>
-              <w:jc w:val="center"/>
+              <w:jc w:val="right"/>
               <w:rPr>
                 <w:sz w:val="28"/>
                 <w:szCs w:val="32"/>
@@ -1813,7 +1813,7 @@
           </w:tcPr>
           <w:p>
             <w:pPr>
-              <w:jc w:val="center"/>
+              <w:jc w:val="right"/>
             </w:pPr>
             <w:r>
               <w:rPr>
@@ -1842,7 +1842,7 @@
           </w:tcPr>
           <w:p>
             <w:pPr>
-              <w:jc w:val="center"/>
+              <w:jc w:val="right"/>
             </w:pPr>
             <w:r>
               <w:rPr>
@@ -1871,7 +1871,7 @@
           </w:tcPr>
           <w:p>
             <w:pPr>
-              <w:jc w:val="center"/>
+              <w:jc w:val="right"/>
             </w:pPr>
             <w:r>
               <w:rPr>
@@ -1905,7 +1905,7 @@
           </w:tcPr>
           <w:p>
             <w:pPr>
-              <w:jc w:val="center"/>
+              <w:jc w:val="right"/>
               <w:rPr>
                 <w:sz w:val="28"/>
                 <w:szCs w:val="32"/>
@@ -1938,7 +1938,7 @@
           </w:tcPr>
           <w:p>
             <w:pPr>
-              <w:jc w:val="center"/>
+              <w:jc w:val="right"/>
             </w:pPr>
             <w:r>
               <w:rPr>
@@ -1967,7 +1967,7 @@
           </w:tcPr>
           <w:p>
             <w:pPr>
-              <w:jc w:val="center"/>
+              <w:jc w:val="right"/>
             </w:pPr>
             <w:r>
               <w:rPr>
@@ -1996,7 +1996,7 @@
           </w:tcPr>
           <w:p>
             <w:pPr>
-              <w:jc w:val="center"/>
+              <w:jc w:val="right"/>
             </w:pPr>
             <w:r>
               <w:rPr>
@@ -2030,7 +2030,7 @@
           </w:tcPr>
           <w:p>
             <w:pPr>
-              <w:jc w:val="center"/>
+              <w:jc w:val="right"/>
               <w:rPr>
                 <w:sz w:val="28"/>
                 <w:szCs w:val="32"/>
@@ -2063,7 +2063,7 @@
           </w:tcPr>
           <w:p>
             <w:pPr>
-              <w:jc w:val="center"/>
+              <w:jc w:val="right"/>
             </w:pPr>
             <w:r>
               <w:rPr>
@@ -2092,7 +2092,7 @@
           </w:tcPr>
           <w:p>
             <w:pPr>
-              <w:jc w:val="center"/>
+              <w:jc w:val="right"/>
             </w:pPr>
             <w:r>
               <w:rPr>
@@ -2121,7 +2121,7 @@
           </w:tcPr>
           <w:p>
             <w:pPr>
-              <w:jc w:val="center"/>
+              <w:jc w:val="right"/>
             </w:pPr>
             <w:r>
               <w:rPr>
@@ -2155,7 +2155,7 @@
           </w:tcPr>
           <w:p>
             <w:pPr>
-              <w:jc w:val="center"/>
+              <w:jc w:val="right"/>
               <w:rPr>
                 <w:sz w:val="28"/>
                 <w:szCs w:val="32"/>
@@ -2188,7 +2188,7 @@
           </w:tcPr>
           <w:p>
             <w:pPr>
-              <w:jc w:val="center"/>
+              <w:jc w:val="right"/>
             </w:pPr>
             <w:r>
               <w:rPr>
@@ -2217,7 +2217,7 @@
           </w:tcPr>
           <w:p>
             <w:pPr>
-              <w:jc w:val="center"/>
+              <w:jc w:val="right"/>
             </w:pPr>
             <w:r>
               <w:rPr>
@@ -2246,7 +2246,7 @@
           </w:tcPr>
           <w:p>
             <w:pPr>
-              <w:jc w:val="center"/>
+              <w:jc w:val="right"/>
             </w:pPr>
             <w:r>
               <w:rPr>
@@ -2280,7 +2280,7 @@
           </w:tcPr>
           <w:p>
             <w:pPr>
-              <w:jc w:val="center"/>
+              <w:jc w:val="right"/>
               <w:rPr>
                 <w:sz w:val="28"/>
                 <w:szCs w:val="32"/>
@@ -2313,7 +2313,7 @@
           </w:tcPr>
           <w:p>
             <w:pPr>
-              <w:jc w:val="center"/>
+              <w:jc w:val="right"/>
             </w:pPr>
             <w:r>
               <w:rPr>
@@ -2342,7 +2342,7 @@
           </w:tcPr>
           <w:p>
             <w:pPr>
-              <w:jc w:val="center"/>
+              <w:jc w:val="right"/>
             </w:pPr>
             <w:r>
               <w:rPr>
@@ -2371,7 +2371,7 @@
           </w:tcPr>
           <w:p>
             <w:pPr>
-              <w:jc w:val="center"/>
+              <w:jc w:val="right"/>
             </w:pPr>
             <w:r>
               <w:rPr>
@@ -2405,7 +2405,7 @@
           </w:tcPr>
           <w:p>
             <w:pPr>
-              <w:jc w:val="center"/>
+              <w:jc w:val="right"/>
               <w:rPr>
                 <w:sz w:val="28"/>
                 <w:szCs w:val="32"/>
@@ -2438,7 +2438,7 @@
           </w:tcPr>
           <w:p>
             <w:pPr>
-              <w:jc w:val="center"/>
+              <w:jc w:val="right"/>
             </w:pPr>
             <w:r>
               <w:rPr>
@@ -2467,7 +2467,7 @@
           </w:tcPr>
           <w:p>
             <w:pPr>
-              <w:jc w:val="center"/>
+              <w:jc w:val="right"/>
             </w:pPr>
             <w:r>
               <w:rPr>
@@ -2496,7 +2496,7 @@
           </w:tcPr>
           <w:p>
             <w:pPr>
-              <w:jc w:val="center"/>
+              <w:jc w:val="right"/>
             </w:pPr>
             <w:r>
               <w:rPr>

</xml_diff>